<commit_message>
docs: enlaces clicables en informe Word
</commit_message>
<xml_diff>
--- a/informe/INFORME-Despliegue-Gestor-Tareas.docx
+++ b/informe/INFORME-Despliegue-Gestor-Tareas.docx
@@ -48,27 +48,48 @@
     </w:p>
     <w:p>
       <w:r>
-        <w:rPr>
-          <w:b w:val="0"/>
-        </w:rPr>
-        <w:t>Repositorio: https://github.com/NICOLAEATS/tareas-app (rama main)</w:t>
+        <w:t xml:space="preserve">Repositorio: </w:t>
+      </w:r>
+      <w:hyperlink r:id="rId13">
+        <w:r>
+          <w:rPr>
+            <w:color w:val="0563C1"/>
+            <w:u w:val="single"/>
+          </w:rPr>
+          <w:t xml:space="preserve">https://github.com/NICOLAEATS/tareas-app</w:t>
+        </w:r>
+      </w:hyperlink>
+      <w:r>
+        <w:t xml:space="preserve"> (rama main)</w:t>
       </w:r>
     </w:p>
     <w:p>
       <w:r>
-        <w:rPr>
-          <w:b w:val="0"/>
-        </w:rPr>
-        <w:t>Backend (Render): https://tareas-api-pndy.onrender.com/api/tareas</w:t>
+        <w:t xml:space="preserve">Backend (Render): </w:t>
       </w:r>
+      <w:hyperlink r:id="rId14">
+        <w:r>
+          <w:rPr>
+            <w:color w:val="0563C1"/>
+            <w:u w:val="single"/>
+          </w:rPr>
+          <w:t xml:space="preserve">https://tareas-api-pndy.onrender.com/api/tareas</w:t>
+        </w:r>
+      </w:hyperlink>
     </w:p>
     <w:p>
       <w:r>
-        <w:rPr>
-          <w:b w:val="0"/>
-        </w:rPr>
-        <w:t>Frontend (Vercel): https://tareas-app-parkeo-pe.vercel.app</w:t>
+        <w:t xml:space="preserve">Frontend (Vercel): </w:t>
       </w:r>
+      <w:hyperlink r:id="rId15">
+        <w:r>
+          <w:rPr>
+            <w:color w:val="0563C1"/>
+            <w:u w:val="single"/>
+          </w:rPr>
+          <w:t xml:space="preserve">https://tareas-app-parkeo-pe.vercel.app</w:t>
+        </w:r>
+      </w:hyperlink>
     </w:p>
     <w:p>
       <w:pPr>
@@ -154,7 +175,19 @@
         <w:pStyle w:val="ListBullet"/>
       </w:pPr>
       <w:r>
-        <w:t>server/index.js:7 — CORS por variable CLIENT_URL (local: http://localhost:5173).</w:t>
+        <w:t xml:space="preserve">server/index.js:7 — CORS por variable CLIENT_URL (local: </w:t>
+      </w:r>
+      <w:hyperlink r:id="rId16">
+        <w:r>
+          <w:rPr>
+            <w:color w:val="0563C1"/>
+            <w:u w:val="single"/>
+          </w:rPr>
+          <w:t xml:space="preserve">http://localhost:5173</w:t>
+        </w:r>
+      </w:hyperlink>
+      <w:r>
+        <w:t>).</w:t>
       </w:r>
     </w:p>
     <w:p>
@@ -170,7 +203,19 @@
         <w:pStyle w:val="ListBullet"/>
       </w:pPr>
       <w:r>
-        <w:t>client/src/App.jsx:5 — API por import.meta.env.VITE_API_URL (local: http://localhost:3001/api/tareas).</w:t>
+        <w:t xml:space="preserve">client/src/App.jsx:5 — API por import.meta.env.VITE_API_URL (local: </w:t>
+      </w:r>
+      <w:hyperlink r:id="rId17">
+        <w:r>
+          <w:rPr>
+            <w:color w:val="0563C1"/>
+            <w:u w:val="single"/>
+          </w:rPr>
+          <w:t xml:space="preserve">http://localhost:3001/api/tareas</w:t>
+        </w:r>
+      </w:hyperlink>
+      <w:r>
+        <w:t>).</w:t>
       </w:r>
     </w:p>
     <w:p>
@@ -183,19 +228,31 @@
     </w:p>
     <w:p>
       <w:r>
-        <w:rPr>
-          <w:b w:val="0"/>
-        </w:rPr>
-        <w:t>Terminal 1 — backend: cd server; npm install; npm run dev → http://localhost:3001/api/tareas</w:t>
+        <w:t xml:space="preserve">Terminal 1 — backend: cd server; npm install; npm run dev → </w:t>
       </w:r>
+      <w:hyperlink r:id="rId17">
+        <w:r>
+          <w:rPr>
+            <w:color w:val="0563C1"/>
+            <w:u w:val="single"/>
+          </w:rPr>
+          <w:t xml:space="preserve">http://localhost:3001/api/tareas</w:t>
+        </w:r>
+      </w:hyperlink>
     </w:p>
     <w:p>
       <w:r>
-        <w:rPr>
-          <w:b w:val="0"/>
-        </w:rPr>
-        <w:t>Terminal 2 — frontend: cd client; npm install; npm run dev → http://localhost:5173</w:t>
+        <w:t xml:space="preserve">Terminal 2 — frontend: cd client; npm install; npm run dev → </w:t>
       </w:r>
+      <w:hyperlink r:id="rId16">
+        <w:r>
+          <w:rPr>
+            <w:color w:val="0563C1"/>
+            <w:u w:val="single"/>
+          </w:rPr>
+          <w:t xml:space="preserve">http://localhost:5173</w:t>
+        </w:r>
+      </w:hyperlink>
     </w:p>
     <w:p>
       <w:r>
@@ -207,11 +264,19 @@
     </w:p>
     <w:p>
       <w:r>
-        <w:rPr>
-          <w:rFonts w:ascii="Consolas" w:hAnsi="Consolas"/>
-          <w:sz w:val="18"/>
-        </w:rPr>
-        <w:t>curl http://localhost:3001/api/tareas                         → 200 array</w:t>
+        <w:t xml:space="preserve">curl </w:t>
+      </w:r>
+      <w:hyperlink r:id="rId17">
+        <w:r>
+          <w:rPr>
+            <w:color w:val="0563C1"/>
+            <w:u w:val="single"/>
+          </w:rPr>
+          <w:t xml:space="preserve">http://localhost:3001/api/tareas</w:t>
+        </w:r>
+      </w:hyperlink>
+      <w:r>
+        <w:t xml:space="preserve">                         → 200 array</w:t>
         <w:br/>
         <w:t>curl -X POST .../api/tareas -d {"titulo":"Mi tarea"}        → 201</w:t>
         <w:br/>
@@ -297,7 +362,19 @@
         <w:pStyle w:val="ListBullet"/>
       </w:pPr>
       <w:r>
-        <w:t>URL pública: https://tareas-api-pndy.onrender.com/api/tareas — responde 200 con JSON inicial.</w:t>
+        <w:t xml:space="preserve">URL pública: </w:t>
+      </w:r>
+      <w:hyperlink r:id="rId14">
+        <w:r>
+          <w:rPr>
+            <w:color w:val="0563C1"/>
+            <w:u w:val="single"/>
+          </w:rPr>
+          <w:t xml:space="preserve">https://tareas-api-pndy.onrender.com/api/tareas</w:t>
+        </w:r>
+      </w:hyperlink>
+      <w:r>
+        <w:t xml:space="preserve"> — responde 200 con JSON inicial.</w:t>
       </w:r>
     </w:p>
     <w:p>
@@ -305,7 +382,19 @@
         <w:pStyle w:val="ListBullet"/>
       </w:pPr>
       <w:r>
-        <w:t>Dashboard: https://dashboard.render.com/web/srv-db8rb86i0phs738odsrg (sección Deploys en Live).</w:t>
+        <w:t xml:space="preserve">Dashboard: </w:t>
+      </w:r>
+      <w:hyperlink r:id="rId18">
+        <w:r>
+          <w:rPr>
+            <w:color w:val="0563C1"/>
+            <w:u w:val="single"/>
+          </w:rPr>
+          <w:t xml:space="preserve">https://dashboard.render.com/web/srv-db8rb86i0phs738odsrg</w:t>
+        </w:r>
+      </w:hyperlink>
+      <w:r>
+        <w:t xml:space="preserve"> (sección Deploys en Live).</w:t>
       </w:r>
     </w:p>
     <w:p>
@@ -345,7 +434,19 @@
         <w:pStyle w:val="ListBullet"/>
       </w:pPr>
       <w:r>
-        <w:t>Variable: VITE_API_URL=https://tareas-api-pndy.onrender.com/api/tareas (production, preview y development).</w:t>
+        <w:t>Variable: VITE_API_URL=</w:t>
+      </w:r>
+      <w:hyperlink r:id="rId14">
+        <w:r>
+          <w:rPr>
+            <w:color w:val="0563C1"/>
+            <w:u w:val="single"/>
+          </w:rPr>
+          <w:t xml:space="preserve">https://tareas-api-pndy.onrender.com/api/tareas</w:t>
+        </w:r>
+      </w:hyperlink>
+      <w:r>
+        <w:t xml:space="preserve"> (production, preview y development).</w:t>
       </w:r>
     </w:p>
     <w:p>
@@ -361,7 +462,22 @@
         <w:pStyle w:val="ListBullet"/>
       </w:pPr>
       <w:r>
-        <w:t>URL pública: https://tareas-app-parkeo-pe.vercel.app. Bundle /assets/index-Bq4TMPsA.js contiene la URL del API.</w:t>
+        <w:t xml:space="preserve">URL pública: </w:t>
+      </w:r>
+      <w:hyperlink r:id="rId15">
+        <w:r>
+          <w:rPr>
+            <w:color w:val="0563C1"/>
+            <w:u w:val="single"/>
+          </w:rPr>
+          <w:t xml:space="preserve">https://tareas-app-parkeo-pe.vercel.app</w:t>
+        </w:r>
+      </w:hyperlink>
+      <w:r>
+        <w:t>.</w:t>
+      </w:r>
+      <w:r>
+        <w:t xml:space="preserve"> Bundle /assets/index-Bq4TMPsA.js contiene la URL del API.</w:t>
       </w:r>
     </w:p>
     <w:p>
@@ -385,7 +501,19 @@
         <w:pStyle w:val="ListBullet"/>
       </w:pPr>
       <w:r>
-        <w:t>En Render se cambió CLIENT_URL de * a https://tareas-app-parkeo-pe.vercel.app y se redesplegó.</w:t>
+        <w:t xml:space="preserve">En Render se cambió CLIENT_URL de * a </w:t>
+      </w:r>
+      <w:hyperlink r:id="rId15">
+        <w:r>
+          <w:rPr>
+            <w:color w:val="0563C1"/>
+            <w:u w:val="single"/>
+          </w:rPr>
+          <w:t xml:space="preserve">https://tareas-app-parkeo-pe.vercel.app</w:t>
+        </w:r>
+      </w:hyperlink>
+      <w:r>
+        <w:t xml:space="preserve"> y se redesplegó.</w:t>
       </w:r>
     </w:p>
     <w:p>
@@ -393,7 +521,19 @@
         <w:pStyle w:val="ListBullet"/>
       </w:pPr>
       <w:r>
-        <w:t>Verificación: respuesta con cabecera access-control-allow-origin: https://tareas-app-parkeo-pe.vercel.app (antes: *).</w:t>
+        <w:t xml:space="preserve">Verificación: respuesta con cabecera access-control-allow-origin: </w:t>
+      </w:r>
+      <w:hyperlink r:id="rId15">
+        <w:r>
+          <w:rPr>
+            <w:color w:val="0563C1"/>
+            <w:u w:val="single"/>
+          </w:rPr>
+          <w:t xml:space="preserve">https://tareas-app-parkeo-pe.vercel.app</w:t>
+        </w:r>
+      </w:hyperlink>
+      <w:r>
+        <w:t xml:space="preserve"> (antes: *).</w:t>
       </w:r>
     </w:p>
     <w:p>
@@ -859,32 +999,68 @@
         <w:pStyle w:val="ListBullet"/>
       </w:pPr>
       <w:r>
-        <w:t>Repo: https://github.com/NICOLAEATS/tareas-app</w:t>
+        <w:t xml:space="preserve">Repo: </w:t>
       </w:r>
+      <w:hyperlink r:id="rId13">
+        <w:r>
+          <w:rPr>
+            <w:color w:val="0563C1"/>
+            <w:u w:val="single"/>
+          </w:rPr>
+          <w:t xml:space="preserve">https://github.com/NICOLAEATS/tareas-app</w:t>
+        </w:r>
+      </w:hyperlink>
     </w:p>
     <w:p>
       <w:pPr>
         <w:pStyle w:val="ListBullet"/>
       </w:pPr>
       <w:r>
-        <w:t>API: https://tareas-api-pndy.onrender.com/api/tareas</w:t>
+        <w:t xml:space="preserve">API: </w:t>
       </w:r>
+      <w:hyperlink r:id="rId14">
+        <w:r>
+          <w:rPr>
+            <w:color w:val="0563C1"/>
+            <w:u w:val="single"/>
+          </w:rPr>
+          <w:t xml:space="preserve">https://tareas-api-pndy.onrender.com/api/tareas</w:t>
+        </w:r>
+      </w:hyperlink>
     </w:p>
     <w:p>
       <w:pPr>
         <w:pStyle w:val="ListBullet"/>
       </w:pPr>
       <w:r>
-        <w:t>App: https://tareas-app-parkeo-pe.vercel.app</w:t>
+        <w:t xml:space="preserve">App: </w:t>
       </w:r>
+      <w:hyperlink r:id="rId15">
+        <w:r>
+          <w:rPr>
+            <w:color w:val="0563C1"/>
+            <w:u w:val="single"/>
+          </w:rPr>
+          <w:t xml:space="preserve">https://tareas-app-parkeo-pe.vercel.app</w:t>
+        </w:r>
+      </w:hyperlink>
     </w:p>
     <w:p>
       <w:pPr>
         <w:pStyle w:val="ListBullet"/>
       </w:pPr>
       <w:r>
-        <w:t>Render: https://dashboard.render.com/web/srv-db8rb86i0phs738odsrg</w:t>
+        <w:t xml:space="preserve">Render: </w:t>
       </w:r>
+      <w:hyperlink r:id="rId18">
+        <w:r>
+          <w:rPr>
+            <w:color w:val="0563C1"/>
+            <w:u w:val="single"/>
+          </w:rPr>
+          <w:t xml:space="preserve">https://dashboard.render.com/web/srv-db8rb86i0phs738odsrg</w:t>
+        </w:r>
+      </w:hyperlink>
     </w:p>
     <w:p>
       <w:pPr>

</xml_diff>